<commit_message>
fix paper template and pdf preflight
</commit_message>
<xml_diff>
--- a/第十一届0000002243图稿/第十一届0000002243图稿.docx
+++ b/第十一届0000002243图稿/第十一届0000002243图稿.docx
@@ -64,7 +64,7 @@
           <w:b/>
           <w:sz w:val="24"/>
         </w:rPr>
-        <w:t>图 1 认证稀疏转移与无截断条件</w:t>
+        <w:t>图0000002243.1 认证稀疏转移与无截断条件</w:t>
       </w:r>
     </w:p>
     <w:p>
@@ -121,7 +121,7 @@
           <w:b/>
           <w:sz w:val="24"/>
         </w:rPr>
-        <w:t>图 2 线性路线壳聚合</w:t>
+        <w:t>图0000002243.2 线性路线壳聚合</w:t>
       </w:r>
     </w:p>
     <w:p>
@@ -178,7 +178,7 @@
           <w:b/>
           <w:sz w:val="24"/>
         </w:rPr>
-        <w:t>图 3 生成链与独立验证边界</w:t>
+        <w:t>图0000002243.3 生成链与独立验证边界</w:t>
       </w:r>
     </w:p>
     <w:sectPr>

</xml_diff>